<commit_message>
Refactor security pipeline to single measurement output
</commit_message>
<xml_diff>
--- a/templates/seguridad_medicion.docx
+++ b/templates/seguridad_medicion.docx
@@ -36,7 +36,7 @@
       <w:pPr>
         <w:spacing w:before="0" w:after="0" w:line="320" w:lineRule="exact"/>
         <w:ind w:left="0" w:right="0" w:firstLine="0"/>
-        <w:jc w:val="both"/>
+        <w:jc w:val="center"/>
         <w:rPr>
           <w:rFonts w:ascii="Archivo" w:hAnsi="Archivo" w:cs="Archivo"/>
           <w:b/>
@@ -163,6 +163,21 @@
     </w:p>
     <w:p>
       <w:pPr>
+        <w:spacing w:before="0" w:after="0" w:line="320" w:lineRule="exact"/>
+        <w:ind w:left="0" w:right="0" w:firstLine="0"/>
+        <w:jc w:val="both"/>
+      </w:pPr>
+      <w:r>
+        <w:rPr>
+          <w:rFonts w:ascii="Archivo Light" w:hAnsi="Archivo Light" w:eastAsia="Archivo Light" w:cs="Archivo Light"/>
+          <w:sz w:val="24"/>
+          <w:szCs w:val="24"/>
+        </w:rPr>
+        <w:t>{introduccion_seguridad}</w:t>
+      </w:r>
+    </w:p>
+    <w:p>
+      <w:pPr>
         <w:spacing w:before="0" w:after="0" w:line="200" w:lineRule="exact"/>
         <w:ind w:left="0" w:right="0" w:firstLine="0"/>
         <w:jc w:val="center"/>
@@ -1673,6 +1688,37 @@
           <w:szCs w:val="24"/>
         </w:rPr>
         <w:t>{cierre_indicador_18}</w:t>
+      </w:r>
+    </w:p>
+    <w:p>
+      <w:pPr>
+        <w:keepNext/>
+        <w:spacing w:before="0" w:after="0" w:line="280" w:lineRule="atLeast"/>
+        <w:ind w:left="0" w:right="0" w:firstLine="0"/>
+        <w:jc w:val="left"/>
+      </w:pPr>
+      <w:r>
+        <w:rPr>
+          <w:rFonts w:ascii="Archivo Light" w:hAnsi="Archivo Light" w:eastAsia="Archivo Light" w:cs="Archivo Light"/>
+          <w:sz w:val="48"/>
+          <w:szCs w:val="48"/>
+        </w:rPr>
+        <w:t>Conclusiones</w:t>
+      </w:r>
+    </w:p>
+    <w:p>
+      <w:pPr>
+        <w:spacing w:before="0" w:after="0" w:line="320" w:lineRule="exact"/>
+        <w:ind w:left="0" w:right="0" w:firstLine="0"/>
+        <w:jc w:val="both"/>
+      </w:pPr>
+      <w:r>
+        <w:rPr>
+          <w:rFonts w:ascii="Archivo Light" w:hAnsi="Archivo Light" w:eastAsia="Archivo Light" w:cs="Archivo Light"/>
+          <w:sz w:val="24"/>
+          <w:szCs w:val="24"/>
+        </w:rPr>
+        <w:t>{conclusiones_seguridad}</w:t>
       </w:r>
     </w:p>
     <w:p>
@@ -1761,170 +1807,6 @@
       </w:pPr>
       <w:r>
         <w:continuationSeparator/>
-      </w:r>
-    </w:p>
-  </w:footnote>
-  <w:footnote w:id="1">
-    <w:p>
-      <w:pPr>
-        <w:pStyle w:val="Textonotapie"/>
-        <w:rPr>
-          <w:lang w:val="en-US"/>
-        </w:rPr>
-      </w:pPr>
-      <w:r>
-        <w:rPr>
-          <w:rStyle w:val="Refdenotaalpie"/>
-        </w:rPr>
-        <w:footnoteRef/>
-      </w:r>
-      <w:r>
-        <w:rPr>
-          <w:lang w:val="en-US"/>
-        </w:rPr>
-        <w:t xml:space="preserve"> Huntington, Samuel P. 2006. </w:t>
-      </w:r>
-      <w:r>
-        <w:rPr>
-          <w:i/>
-          <w:iCs/>
-          <w:lang w:val="en-US"/>
-        </w:rPr>
-        <w:t>Political Order in Changing Societies</w:t>
-      </w:r>
-      <w:r>
-        <w:rPr>
-          <w:lang w:val="en-US"/>
-        </w:rPr>
-        <w:t xml:space="preserve">. New Haven, CT: Yale </w:t>
-      </w:r>
-      <w:r>
-        <w:rPr>
-          <w:rStyle w:val="Refdenotaalpie"/>
-          <w:vertAlign w:val="baseline"/>
-          <w:lang w:val="en-US"/>
-        </w:rPr>
-        <w:t>University</w:t>
-      </w:r>
-      <w:r>
-        <w:rPr>
-          <w:lang w:val="en-US"/>
-        </w:rPr>
-        <w:t xml:space="preserve"> Press.</w:t>
-      </w:r>
-    </w:p>
-  </w:footnote>
-  <w:footnote w:id="2">
-    <w:p>
-      <w:pPr>
-        <w:pStyle w:val="Textonotapie"/>
-        <w:rPr>
-          <w:lang w:val="en-US"/>
-        </w:rPr>
-      </w:pPr>
-      <w:r>
-        <w:rPr>
-          <w:rStyle w:val="Refdenotaalpie"/>
-        </w:rPr>
-        <w:footnoteRef/>
-      </w:r>
-      <w:r>
-        <w:rPr>
-          <w:lang w:val="en-US"/>
-        </w:rPr>
-        <w:t xml:space="preserve"> Huntington, Samuel P. 2006. </w:t>
-      </w:r>
-      <w:r>
-        <w:rPr>
-          <w:i/>
-          <w:iCs/>
-          <w:lang w:val="en-US"/>
-        </w:rPr>
-        <w:t>Political Order in Changing Societies</w:t>
-      </w:r>
-      <w:r>
-        <w:rPr>
-          <w:lang w:val="en-US"/>
-        </w:rPr>
-        <w:t xml:space="preserve">. </w:t>
-      </w:r>
-      <w:r>
-        <w:rPr>
-          <w:lang w:val="en-US"/>
-        </w:rPr>
-        <w:t>New Haven, CT: Yale University Press.</w:t>
-      </w:r>
-    </w:p>
-  </w:footnote>
-  <w:footnote w:id="3">
-    <w:p>
-      <w:pPr>
-        <w:pStyle w:val="Textonotapie"/>
-        <w:rPr>
-          <w:lang w:val="en-US"/>
-        </w:rPr>
-      </w:pPr>
-      <w:r>
-        <w:rPr>
-          <w:rStyle w:val="Refdenotaalpie"/>
-        </w:rPr>
-        <w:footnoteRef/>
-      </w:r>
-      <w:r>
-        <w:rPr>
-          <w:lang w:val="en-US"/>
-        </w:rPr>
-        <w:t xml:space="preserve"> Wegrich, Kai, 'Jeffrey L. Pressman and Aaron B. Wildavsky, Implementation', in Martin Lodge, Edward C. Page, and Steven J. Balla (eds), </w:t>
-      </w:r>
-      <w:r>
-        <w:rPr>
-          <w:i/>
-          <w:iCs/>
-          <w:lang w:val="en-US"/>
-        </w:rPr>
-        <w:t>The Oxford Handbook of Classics in Public Policy and Administration</w:t>
-      </w:r>
-      <w:r>
-        <w:rPr>
-          <w:lang w:val="en-US"/>
-        </w:rPr>
-        <w:t>, Oxford Handbooks (2015; online edn, Oxford Academic, 7 July 2016), https://doi.org/10.1093/oxfordhb/9780199646135.013.10</w:t>
-      </w:r>
-    </w:p>
-  </w:footnote>
-  <w:footnote w:id="4">
-    <w:p>
-      <w:pPr>
-        <w:pStyle w:val="Textonotapie"/>
-        <w:rPr>
-          <w:lang w:val="en-US"/>
-        </w:rPr>
-      </w:pPr>
-      <w:r>
-        <w:rPr>
-          <w:rStyle w:val="Refdenotaalpie"/>
-        </w:rPr>
-        <w:footnoteRef/>
-      </w:r>
-      <w:r>
-        <w:rPr>
-          <w:lang w:val="en-US"/>
-        </w:rPr>
-        <w:t xml:space="preserve"> X.Wu, et al., Policy capacity: A conceptual framework for understanding policy competences and capabilities, </w:t>
-      </w:r>
-      <w:r>
-        <w:rPr>
-          <w:i/>
-          <w:iCs/>
-          <w:lang w:val="en-US"/>
-        </w:rPr>
-        <w:t xml:space="preserve">Policy and Society </w:t>
-      </w:r>
-      <w:r>
-        <w:rPr>
-          <w:lang w:val="en-US"/>
-        </w:rPr>
-        <w:t xml:space="preserve">(2015), http://dx.doi.org/10.1016/j.polsoc.2015.09.001  </w:t>
       </w:r>
     </w:p>
   </w:footnote>

</xml_diff>

<commit_message>
Actualiza pipeline editorial de seguridad
</commit_message>
<xml_diff>
--- a/templates/seguridad_medicion.docx
+++ b/templates/seguridad_medicion.docx
@@ -14,7 +14,7 @@
           <w:sz w:val="52"/>
           <w:szCs w:val="52"/>
         </w:rPr>
-        <w:t>Mediciones de Funcionamiento Municipal — SEGURIDAD</w:t>
+        <w:t>Estudio de Seguridad</w:t>
       </w:r>
     </w:p>
     <w:p>
@@ -163,21 +163,6 @@
     </w:p>
     <w:p>
       <w:pPr>
-        <w:spacing w:before="0" w:after="0" w:line="320" w:lineRule="exact"/>
-        <w:ind w:left="0" w:right="0" w:firstLine="0"/>
-        <w:jc w:val="both"/>
-      </w:pPr>
-      <w:r>
-        <w:rPr>
-          <w:rFonts w:ascii="Archivo Light" w:hAnsi="Archivo Light" w:eastAsia="Archivo Light" w:cs="Archivo Light"/>
-          <w:sz w:val="24"/>
-          <w:szCs w:val="24"/>
-        </w:rPr>
-        <w:t>{introduccion_seguridad}</w:t>
-      </w:r>
-    </w:p>
-    <w:p>
-      <w:pPr>
         <w:spacing w:before="0" w:after="0" w:line="200" w:lineRule="exact"/>
         <w:ind w:left="0" w:right="0" w:firstLine="0"/>
         <w:jc w:val="center"/>
@@ -257,7 +242,7 @@
           <w:sz w:val="48"/>
           <w:szCs w:val="48"/>
         </w:rPr>
-        <w:t>Indicador 01: Plan o programa de protección civil</w:t>
+        <w:t>Plan o programa de protección civil</w:t>
       </w:r>
     </w:p>
     <w:p>
@@ -273,51 +258,6 @@
           <w:szCs w:val="24"/>
         </w:rPr>
         <w:t>{analisis_indicador_01}</w:t>
-      </w:r>
-    </w:p>
-    <w:p>
-      <w:pPr>
-        <w:spacing w:before="0" w:after="0" w:line="320" w:lineRule="exact"/>
-        <w:ind w:left="0" w:right="0" w:firstLine="0"/>
-        <w:jc w:val="both"/>
-      </w:pPr>
-      <w:r>
-        <w:rPr>
-          <w:rFonts w:ascii="Archivo Light" w:hAnsi="Archivo Light" w:eastAsia="Archivo Light" w:cs="Archivo Light"/>
-          <w:sz w:val="24"/>
-          <w:szCs w:val="24"/>
-        </w:rPr>
-        <w:t>{graficas_indicador_01}</w:t>
-      </w:r>
-    </w:p>
-    <w:p>
-      <w:pPr>
-        <w:spacing w:before="0" w:after="0" w:line="320" w:lineRule="exact"/>
-        <w:ind w:left="0" w:right="0" w:firstLine="0"/>
-        <w:jc w:val="both"/>
-      </w:pPr>
-      <w:r>
-        <w:rPr>
-          <w:rFonts w:ascii="Archivo Light" w:hAnsi="Archivo Light" w:eastAsia="Archivo Light" w:cs="Archivo Light"/>
-          <w:sz w:val="24"/>
-          <w:szCs w:val="24"/>
-        </w:rPr>
-        <w:t>{tablas_indicador_01}</w:t>
-      </w:r>
-    </w:p>
-    <w:p>
-      <w:pPr>
-        <w:spacing w:before="0" w:after="0" w:line="320" w:lineRule="exact"/>
-        <w:ind w:left="0" w:right="0" w:firstLine="0"/>
-        <w:jc w:val="both"/>
-      </w:pPr>
-      <w:r>
-        <w:rPr>
-          <w:rFonts w:ascii="Archivo Light" w:hAnsi="Archivo Light" w:eastAsia="Archivo Light" w:cs="Archivo Light"/>
-          <w:sz w:val="24"/>
-          <w:szCs w:val="24"/>
-        </w:rPr>
-        <w:t>{cierre_indicador_01}</w:t>
       </w:r>
     </w:p>
     <w:p>
@@ -339,7 +279,7 @@
           <w:sz w:val="48"/>
           <w:szCs w:val="48"/>
         </w:rPr>
-        <w:t>Indicador 02: Capacitación en materia de protección civil</w:t>
+        <w:t>Capacitación en materia de protección civil</w:t>
       </w:r>
     </w:p>
     <w:p>
@@ -359,6 +299,22 @@
     </w:p>
     <w:p>
       <w:pPr>
+        <w:keepNext/>
+        <w:spacing w:before="0" w:after="0" w:line="280" w:lineRule="atLeast"/>
+        <w:ind w:left="0" w:right="0" w:firstLine="0"/>
+        <w:jc w:val="left"/>
+      </w:pPr>
+      <w:r>
+        <w:rPr>
+          <w:rFonts w:ascii="Archivo Light" w:hAnsi="Archivo Light" w:eastAsia="Archivo Light" w:cs="Archivo Light"/>
+          <w:sz w:val="48"/>
+          <w:szCs w:val="48"/>
+        </w:rPr>
+        <w:t>Temas de la capacitación de protección civil</w:t>
+      </w:r>
+    </w:p>
+    <w:p>
+      <w:pPr>
         <w:spacing w:before="0" w:after="0" w:line="320" w:lineRule="exact"/>
         <w:ind w:left="0" w:right="0" w:firstLine="0"/>
         <w:jc w:val="both"/>
@@ -369,113 +325,7 @@
           <w:sz w:val="24"/>
           <w:szCs w:val="24"/>
         </w:rPr>
-        <w:t>{graficas_indicador_02}</w:t>
-      </w:r>
-    </w:p>
-    <w:p>
-      <w:pPr>
-        <w:spacing w:before="0" w:after="0" w:line="320" w:lineRule="exact"/>
-        <w:ind w:left="0" w:right="0" w:firstLine="0"/>
-        <w:jc w:val="both"/>
-      </w:pPr>
-      <w:r>
-        <w:rPr>
-          <w:rFonts w:ascii="Archivo Light" w:hAnsi="Archivo Light" w:eastAsia="Archivo Light" w:cs="Archivo Light"/>
-          <w:sz w:val="24"/>
-          <w:szCs w:val="24"/>
-        </w:rPr>
-        <w:t>{tablas_indicador_02}</w:t>
-      </w:r>
-    </w:p>
-    <w:p>
-      <w:pPr>
-        <w:spacing w:before="0" w:after="0" w:line="320" w:lineRule="exact"/>
-        <w:ind w:left="0" w:right="0" w:firstLine="0"/>
-        <w:jc w:val="both"/>
-      </w:pPr>
-      <w:r>
-        <w:rPr>
-          <w:rFonts w:ascii="Archivo Light" w:hAnsi="Archivo Light" w:eastAsia="Archivo Light" w:cs="Archivo Light"/>
-          <w:sz w:val="24"/>
-          <w:szCs w:val="24"/>
-        </w:rPr>
-        <w:t>{cierre_indicador_02}</w:t>
-      </w:r>
-    </w:p>
-    <w:p>
-      <w:pPr>
-        <w:keepNext/>
-        <w:spacing w:before="0" w:after="0" w:line="280" w:lineRule="atLeast"/>
-        <w:ind w:left="0" w:right="0" w:firstLine="0"/>
-        <w:jc w:val="left"/>
-      </w:pPr>
-      <w:r>
-        <w:rPr>
-          <w:rFonts w:ascii="Archivo Light" w:hAnsi="Archivo Light" w:eastAsia="Archivo Light" w:cs="Archivo Light"/>
-          <w:sz w:val="48"/>
-          <w:szCs w:val="48"/>
-        </w:rPr>
-        <w:t>Indicador 03: Temas de la capacitación de protección civil</w:t>
-      </w:r>
-    </w:p>
-    <w:p>
-      <w:pPr>
-        <w:spacing w:before="0" w:after="0" w:line="320" w:lineRule="exact"/>
-        <w:ind w:left="0" w:right="0" w:firstLine="0"/>
-        <w:jc w:val="both"/>
-      </w:pPr>
-      <w:r>
-        <w:rPr>
-          <w:rFonts w:ascii="Archivo Light" w:hAnsi="Archivo Light" w:eastAsia="Archivo Light" w:cs="Archivo Light"/>
-          <w:sz w:val="24"/>
-          <w:szCs w:val="24"/>
-        </w:rPr>
         <w:t>{analisis_indicador_03}</w:t>
-      </w:r>
-    </w:p>
-    <w:p>
-      <w:pPr>
-        <w:spacing w:before="0" w:after="0" w:line="320" w:lineRule="exact"/>
-        <w:ind w:left="0" w:right="0" w:firstLine="0"/>
-        <w:jc w:val="both"/>
-      </w:pPr>
-      <w:r>
-        <w:rPr>
-          <w:rFonts w:ascii="Archivo Light" w:hAnsi="Archivo Light" w:eastAsia="Archivo Light" w:cs="Archivo Light"/>
-          <w:sz w:val="24"/>
-          <w:szCs w:val="24"/>
-        </w:rPr>
-        <w:t>{graficas_indicador_03}</w:t>
-      </w:r>
-    </w:p>
-    <w:p>
-      <w:pPr>
-        <w:spacing w:before="0" w:after="0" w:line="320" w:lineRule="exact"/>
-        <w:ind w:left="0" w:right="0" w:firstLine="0"/>
-        <w:jc w:val="both"/>
-      </w:pPr>
-      <w:r>
-        <w:rPr>
-          <w:rFonts w:ascii="Archivo Light" w:hAnsi="Archivo Light" w:eastAsia="Archivo Light" w:cs="Archivo Light"/>
-          <w:sz w:val="24"/>
-          <w:szCs w:val="24"/>
-        </w:rPr>
-        <w:t>{tablas_indicador_03}</w:t>
-      </w:r>
-    </w:p>
-    <w:p>
-      <w:pPr>
-        <w:spacing w:before="0" w:after="0" w:line="320" w:lineRule="exact"/>
-        <w:ind w:left="0" w:right="0" w:firstLine="0"/>
-        <w:jc w:val="both"/>
-      </w:pPr>
-      <w:r>
-        <w:rPr>
-          <w:rFonts w:ascii="Archivo Light" w:hAnsi="Archivo Light" w:eastAsia="Archivo Light" w:cs="Archivo Light"/>
-          <w:sz w:val="24"/>
-          <w:szCs w:val="24"/>
-        </w:rPr>
-        <w:t>{cierre_indicador_03}</w:t>
       </w:r>
     </w:p>
     <w:p>
@@ -497,7 +347,7 @@
           <w:sz w:val="48"/>
           <w:szCs w:val="48"/>
         </w:rPr>
-        <w:t>Indicador 04: Personal destinado a funciones de seguridad pública</w:t>
+        <w:t>Personal destinado a funciones de seguridad pública</w:t>
       </w:r>
     </w:p>
     <w:p>
@@ -513,51 +363,6 @@
           <w:szCs w:val="24"/>
         </w:rPr>
         <w:t>{analisis_indicador_04}</w:t>
-      </w:r>
-    </w:p>
-    <w:p>
-      <w:pPr>
-        <w:spacing w:before="0" w:after="0" w:line="320" w:lineRule="exact"/>
-        <w:ind w:left="0" w:right="0" w:firstLine="0"/>
-        <w:jc w:val="both"/>
-      </w:pPr>
-      <w:r>
-        <w:rPr>
-          <w:rFonts w:ascii="Archivo Light" w:hAnsi="Archivo Light" w:eastAsia="Archivo Light" w:cs="Archivo Light"/>
-          <w:sz w:val="24"/>
-          <w:szCs w:val="24"/>
-        </w:rPr>
-        <w:t>{graficas_indicador_04}</w:t>
-      </w:r>
-    </w:p>
-    <w:p>
-      <w:pPr>
-        <w:spacing w:before="0" w:after="0" w:line="320" w:lineRule="exact"/>
-        <w:ind w:left="0" w:right="0" w:firstLine="0"/>
-        <w:jc w:val="both"/>
-      </w:pPr>
-      <w:r>
-        <w:rPr>
-          <w:rFonts w:ascii="Archivo Light" w:hAnsi="Archivo Light" w:eastAsia="Archivo Light" w:cs="Archivo Light"/>
-          <w:sz w:val="24"/>
-          <w:szCs w:val="24"/>
-        </w:rPr>
-        <w:t>{tablas_indicador_04}</w:t>
-      </w:r>
-    </w:p>
-    <w:p>
-      <w:pPr>
-        <w:spacing w:before="0" w:after="0" w:line="320" w:lineRule="exact"/>
-        <w:ind w:left="0" w:right="0" w:firstLine="0"/>
-        <w:jc w:val="both"/>
-      </w:pPr>
-      <w:r>
-        <w:rPr>
-          <w:rFonts w:ascii="Archivo Light" w:hAnsi="Archivo Light" w:eastAsia="Archivo Light" w:cs="Archivo Light"/>
-          <w:sz w:val="24"/>
-          <w:szCs w:val="24"/>
-        </w:rPr>
-        <w:t>{cierre_indicador_04}</w:t>
       </w:r>
     </w:p>
     <w:p>
@@ -579,7 +384,7 @@
           <w:sz w:val="48"/>
           <w:szCs w:val="48"/>
         </w:rPr>
-        <w:t>Indicador 05: Evaluaciones de control de confianza</w:t>
+        <w:t>Evaluaciones de control de confianza</w:t>
       </w:r>
     </w:p>
     <w:p>
@@ -595,51 +400,6 @@
           <w:szCs w:val="24"/>
         </w:rPr>
         <w:t>{analisis_indicador_05}</w:t>
-      </w:r>
-    </w:p>
-    <w:p>
-      <w:pPr>
-        <w:spacing w:before="0" w:after="0" w:line="320" w:lineRule="exact"/>
-        <w:ind w:left="0" w:right="0" w:firstLine="0"/>
-        <w:jc w:val="both"/>
-      </w:pPr>
-      <w:r>
-        <w:rPr>
-          <w:rFonts w:ascii="Archivo Light" w:hAnsi="Archivo Light" w:eastAsia="Archivo Light" w:cs="Archivo Light"/>
-          <w:sz w:val="24"/>
-          <w:szCs w:val="24"/>
-        </w:rPr>
-        <w:t>{graficas_indicador_05}</w:t>
-      </w:r>
-    </w:p>
-    <w:p>
-      <w:pPr>
-        <w:spacing w:before="0" w:after="0" w:line="320" w:lineRule="exact"/>
-        <w:ind w:left="0" w:right="0" w:firstLine="0"/>
-        <w:jc w:val="both"/>
-      </w:pPr>
-      <w:r>
-        <w:rPr>
-          <w:rFonts w:ascii="Archivo Light" w:hAnsi="Archivo Light" w:eastAsia="Archivo Light" w:cs="Archivo Light"/>
-          <w:sz w:val="24"/>
-          <w:szCs w:val="24"/>
-        </w:rPr>
-        <w:t>{tablas_indicador_05}</w:t>
-      </w:r>
-    </w:p>
-    <w:p>
-      <w:pPr>
-        <w:spacing w:before="0" w:after="0" w:line="320" w:lineRule="exact"/>
-        <w:ind w:left="0" w:right="0" w:firstLine="0"/>
-        <w:jc w:val="both"/>
-      </w:pPr>
-      <w:r>
-        <w:rPr>
-          <w:rFonts w:ascii="Archivo Light" w:hAnsi="Archivo Light" w:eastAsia="Archivo Light" w:cs="Archivo Light"/>
-          <w:sz w:val="24"/>
-          <w:szCs w:val="24"/>
-        </w:rPr>
-        <w:t>{cierre_indicador_05}</w:t>
       </w:r>
     </w:p>
     <w:p>
@@ -661,7 +421,7 @@
           <w:sz w:val="48"/>
           <w:szCs w:val="48"/>
         </w:rPr>
-        <w:t>Indicador 06: Instituto de formación, capacitación y/o profesionalización</w:t>
+        <w:t>Instituto de formación, capacitación y/o profesionalización</w:t>
       </w:r>
     </w:p>
     <w:p>
@@ -681,6 +441,22 @@
     </w:p>
     <w:p>
       <w:pPr>
+        <w:keepNext/>
+        <w:spacing w:before="0" w:after="0" w:line="280" w:lineRule="atLeast"/>
+        <w:ind w:left="0" w:right="0" w:firstLine="0"/>
+        <w:jc w:val="left"/>
+      </w:pPr>
+      <w:r>
+        <w:rPr>
+          <w:rFonts w:ascii="Archivo Light" w:hAnsi="Archivo Light" w:eastAsia="Archivo Light" w:cs="Archivo Light"/>
+          <w:sz w:val="48"/>
+          <w:szCs w:val="48"/>
+        </w:rPr>
+        <w:t>Certificado Único Policial vigente</w:t>
+      </w:r>
+    </w:p>
+    <w:p>
+      <w:pPr>
         <w:spacing w:before="0" w:after="0" w:line="320" w:lineRule="exact"/>
         <w:ind w:left="0" w:right="0" w:firstLine="0"/>
         <w:jc w:val="both"/>
@@ -691,113 +467,7 @@
           <w:sz w:val="24"/>
           <w:szCs w:val="24"/>
         </w:rPr>
-        <w:t>{graficas_indicador_06}</w:t>
-      </w:r>
-    </w:p>
-    <w:p>
-      <w:pPr>
-        <w:spacing w:before="0" w:after="0" w:line="320" w:lineRule="exact"/>
-        <w:ind w:left="0" w:right="0" w:firstLine="0"/>
-        <w:jc w:val="both"/>
-      </w:pPr>
-      <w:r>
-        <w:rPr>
-          <w:rFonts w:ascii="Archivo Light" w:hAnsi="Archivo Light" w:eastAsia="Archivo Light" w:cs="Archivo Light"/>
-          <w:sz w:val="24"/>
-          <w:szCs w:val="24"/>
-        </w:rPr>
-        <w:t>{tablas_indicador_06}</w:t>
-      </w:r>
-    </w:p>
-    <w:p>
-      <w:pPr>
-        <w:spacing w:before="0" w:after="0" w:line="320" w:lineRule="exact"/>
-        <w:ind w:left="0" w:right="0" w:firstLine="0"/>
-        <w:jc w:val="both"/>
-      </w:pPr>
-      <w:r>
-        <w:rPr>
-          <w:rFonts w:ascii="Archivo Light" w:hAnsi="Archivo Light" w:eastAsia="Archivo Light" w:cs="Archivo Light"/>
-          <w:sz w:val="24"/>
-          <w:szCs w:val="24"/>
-        </w:rPr>
-        <w:t>{cierre_indicador_06}</w:t>
-      </w:r>
-    </w:p>
-    <w:p>
-      <w:pPr>
-        <w:keepNext/>
-        <w:spacing w:before="0" w:after="0" w:line="280" w:lineRule="atLeast"/>
-        <w:ind w:left="0" w:right="0" w:firstLine="0"/>
-        <w:jc w:val="left"/>
-      </w:pPr>
-      <w:r>
-        <w:rPr>
-          <w:rFonts w:ascii="Archivo Light" w:hAnsi="Archivo Light" w:eastAsia="Archivo Light" w:cs="Archivo Light"/>
-          <w:sz w:val="48"/>
-          <w:szCs w:val="48"/>
-        </w:rPr>
-        <w:t>Indicador 07: Certificado Único Policial vigente</w:t>
-      </w:r>
-    </w:p>
-    <w:p>
-      <w:pPr>
-        <w:spacing w:before="0" w:after="0" w:line="320" w:lineRule="exact"/>
-        <w:ind w:left="0" w:right="0" w:firstLine="0"/>
-        <w:jc w:val="both"/>
-      </w:pPr>
-      <w:r>
-        <w:rPr>
-          <w:rFonts w:ascii="Archivo Light" w:hAnsi="Archivo Light" w:eastAsia="Archivo Light" w:cs="Archivo Light"/>
-          <w:sz w:val="24"/>
-          <w:szCs w:val="24"/>
-        </w:rPr>
         <w:t>{analisis_indicador_07}</w:t>
-      </w:r>
-    </w:p>
-    <w:p>
-      <w:pPr>
-        <w:spacing w:before="0" w:after="0" w:line="320" w:lineRule="exact"/>
-        <w:ind w:left="0" w:right="0" w:firstLine="0"/>
-        <w:jc w:val="both"/>
-      </w:pPr>
-      <w:r>
-        <w:rPr>
-          <w:rFonts w:ascii="Archivo Light" w:hAnsi="Archivo Light" w:eastAsia="Archivo Light" w:cs="Archivo Light"/>
-          <w:sz w:val="24"/>
-          <w:szCs w:val="24"/>
-        </w:rPr>
-        <w:t>{graficas_indicador_07}</w:t>
-      </w:r>
-    </w:p>
-    <w:p>
-      <w:pPr>
-        <w:spacing w:before="0" w:after="0" w:line="320" w:lineRule="exact"/>
-        <w:ind w:left="0" w:right="0" w:firstLine="0"/>
-        <w:jc w:val="both"/>
-      </w:pPr>
-      <w:r>
-        <w:rPr>
-          <w:rFonts w:ascii="Archivo Light" w:hAnsi="Archivo Light" w:eastAsia="Archivo Light" w:cs="Archivo Light"/>
-          <w:sz w:val="24"/>
-          <w:szCs w:val="24"/>
-        </w:rPr>
-        <w:t>{tablas_indicador_07}</w:t>
-      </w:r>
-    </w:p>
-    <w:p>
-      <w:pPr>
-        <w:spacing w:before="0" w:after="0" w:line="320" w:lineRule="exact"/>
-        <w:ind w:left="0" w:right="0" w:firstLine="0"/>
-        <w:jc w:val="both"/>
-      </w:pPr>
-      <w:r>
-        <w:rPr>
-          <w:rFonts w:ascii="Archivo Light" w:hAnsi="Archivo Light" w:eastAsia="Archivo Light" w:cs="Archivo Light"/>
-          <w:sz w:val="24"/>
-          <w:szCs w:val="24"/>
-        </w:rPr>
-        <w:t>{cierre_indicador_07}</w:t>
       </w:r>
     </w:p>
     <w:p>
@@ -819,7 +489,7 @@
           <w:sz w:val="48"/>
           <w:szCs w:val="48"/>
         </w:rPr>
-        <w:t>Indicador 08: Uniformes</w:t>
+        <w:t>Uniformes</w:t>
       </w:r>
     </w:p>
     <w:p>
@@ -835,51 +505,6 @@
           <w:szCs w:val="24"/>
         </w:rPr>
         <w:t>{analisis_indicador_08}</w:t>
-      </w:r>
-    </w:p>
-    <w:p>
-      <w:pPr>
-        <w:spacing w:before="0" w:after="0" w:line="320" w:lineRule="exact"/>
-        <w:ind w:left="0" w:right="0" w:firstLine="0"/>
-        <w:jc w:val="both"/>
-      </w:pPr>
-      <w:r>
-        <w:rPr>
-          <w:rFonts w:ascii="Archivo Light" w:hAnsi="Archivo Light" w:eastAsia="Archivo Light" w:cs="Archivo Light"/>
-          <w:sz w:val="24"/>
-          <w:szCs w:val="24"/>
-        </w:rPr>
-        <w:t>{graficas_indicador_08}</w:t>
-      </w:r>
-    </w:p>
-    <w:p>
-      <w:pPr>
-        <w:spacing w:before="0" w:after="0" w:line="320" w:lineRule="exact"/>
-        <w:ind w:left="0" w:right="0" w:firstLine="0"/>
-        <w:jc w:val="both"/>
-      </w:pPr>
-      <w:r>
-        <w:rPr>
-          <w:rFonts w:ascii="Archivo Light" w:hAnsi="Archivo Light" w:eastAsia="Archivo Light" w:cs="Archivo Light"/>
-          <w:sz w:val="24"/>
-          <w:szCs w:val="24"/>
-        </w:rPr>
-        <w:t>{tablas_indicador_08}</w:t>
-      </w:r>
-    </w:p>
-    <w:p>
-      <w:pPr>
-        <w:spacing w:before="0" w:after="0" w:line="320" w:lineRule="exact"/>
-        <w:ind w:left="0" w:right="0" w:firstLine="0"/>
-        <w:jc w:val="both"/>
-      </w:pPr>
-      <w:r>
-        <w:rPr>
-          <w:rFonts w:ascii="Archivo Light" w:hAnsi="Archivo Light" w:eastAsia="Archivo Light" w:cs="Archivo Light"/>
-          <w:sz w:val="24"/>
-          <w:szCs w:val="24"/>
-        </w:rPr>
-        <w:t>{cierre_indicador_08}</w:t>
       </w:r>
     </w:p>
     <w:p>
@@ -901,7 +526,7 @@
           <w:sz w:val="48"/>
           <w:szCs w:val="48"/>
         </w:rPr>
-        <w:t>Indicador 09: Equipamiento</w:t>
+        <w:t>Equipamiento</w:t>
       </w:r>
     </w:p>
     <w:p>
@@ -921,6 +546,22 @@
     </w:p>
     <w:p>
       <w:pPr>
+        <w:keepNext/>
+        <w:spacing w:before="0" w:after="0" w:line="280" w:lineRule="atLeast"/>
+        <w:ind w:left="0" w:right="0" w:firstLine="0"/>
+        <w:jc w:val="left"/>
+      </w:pPr>
+      <w:r>
+        <w:rPr>
+          <w:rFonts w:ascii="Archivo Light" w:hAnsi="Archivo Light" w:eastAsia="Archivo Light" w:cs="Archivo Light"/>
+          <w:sz w:val="48"/>
+          <w:szCs w:val="48"/>
+        </w:rPr>
+        <w:t>Temas de capacitación policial</w:t>
+      </w:r>
+    </w:p>
+    <w:p>
+      <w:pPr>
         <w:spacing w:before="0" w:after="0" w:line="320" w:lineRule="exact"/>
         <w:ind w:left="0" w:right="0" w:firstLine="0"/>
         <w:jc w:val="both"/>
@@ -931,113 +572,7 @@
           <w:sz w:val="24"/>
           <w:szCs w:val="24"/>
         </w:rPr>
-        <w:t>{graficas_indicador_09}</w:t>
-      </w:r>
-    </w:p>
-    <w:p>
-      <w:pPr>
-        <w:spacing w:before="0" w:after="0" w:line="320" w:lineRule="exact"/>
-        <w:ind w:left="0" w:right="0" w:firstLine="0"/>
-        <w:jc w:val="both"/>
-      </w:pPr>
-      <w:r>
-        <w:rPr>
-          <w:rFonts w:ascii="Archivo Light" w:hAnsi="Archivo Light" w:eastAsia="Archivo Light" w:cs="Archivo Light"/>
-          <w:sz w:val="24"/>
-          <w:szCs w:val="24"/>
-        </w:rPr>
-        <w:t>{tablas_indicador_09}</w:t>
-      </w:r>
-    </w:p>
-    <w:p>
-      <w:pPr>
-        <w:spacing w:before="0" w:after="0" w:line="320" w:lineRule="exact"/>
-        <w:ind w:left="0" w:right="0" w:firstLine="0"/>
-        <w:jc w:val="both"/>
-      </w:pPr>
-      <w:r>
-        <w:rPr>
-          <w:rFonts w:ascii="Archivo Light" w:hAnsi="Archivo Light" w:eastAsia="Archivo Light" w:cs="Archivo Light"/>
-          <w:sz w:val="24"/>
-          <w:szCs w:val="24"/>
-        </w:rPr>
-        <w:t>{cierre_indicador_09}</w:t>
-      </w:r>
-    </w:p>
-    <w:p>
-      <w:pPr>
-        <w:keepNext/>
-        <w:spacing w:before="0" w:after="0" w:line="280" w:lineRule="atLeast"/>
-        <w:ind w:left="0" w:right="0" w:firstLine="0"/>
-        <w:jc w:val="left"/>
-      </w:pPr>
-      <w:r>
-        <w:rPr>
-          <w:rFonts w:ascii="Archivo Light" w:hAnsi="Archivo Light" w:eastAsia="Archivo Light" w:cs="Archivo Light"/>
-          <w:sz w:val="48"/>
-          <w:szCs w:val="48"/>
-        </w:rPr>
-        <w:t>Indicador 10: Temas de capacitación policial</w:t>
-      </w:r>
-    </w:p>
-    <w:p>
-      <w:pPr>
-        <w:spacing w:before="0" w:after="0" w:line="320" w:lineRule="exact"/>
-        <w:ind w:left="0" w:right="0" w:firstLine="0"/>
-        <w:jc w:val="both"/>
-      </w:pPr>
-      <w:r>
-        <w:rPr>
-          <w:rFonts w:ascii="Archivo Light" w:hAnsi="Archivo Light" w:eastAsia="Archivo Light" w:cs="Archivo Light"/>
-          <w:sz w:val="24"/>
-          <w:szCs w:val="24"/>
-        </w:rPr>
         <w:t>{analisis_indicador_10}</w:t>
-      </w:r>
-    </w:p>
-    <w:p>
-      <w:pPr>
-        <w:spacing w:before="0" w:after="0" w:line="320" w:lineRule="exact"/>
-        <w:ind w:left="0" w:right="0" w:firstLine="0"/>
-        <w:jc w:val="both"/>
-      </w:pPr>
-      <w:r>
-        <w:rPr>
-          <w:rFonts w:ascii="Archivo Light" w:hAnsi="Archivo Light" w:eastAsia="Archivo Light" w:cs="Archivo Light"/>
-          <w:sz w:val="24"/>
-          <w:szCs w:val="24"/>
-        </w:rPr>
-        <w:t>{graficas_indicador_10}</w:t>
-      </w:r>
-    </w:p>
-    <w:p>
-      <w:pPr>
-        <w:spacing w:before="0" w:after="0" w:line="320" w:lineRule="exact"/>
-        <w:ind w:left="0" w:right="0" w:firstLine="0"/>
-        <w:jc w:val="both"/>
-      </w:pPr>
-      <w:r>
-        <w:rPr>
-          <w:rFonts w:ascii="Archivo Light" w:hAnsi="Archivo Light" w:eastAsia="Archivo Light" w:cs="Archivo Light"/>
-          <w:sz w:val="24"/>
-          <w:szCs w:val="24"/>
-        </w:rPr>
-        <w:t>{tablas_indicador_10}</w:t>
-      </w:r>
-    </w:p>
-    <w:p>
-      <w:pPr>
-        <w:spacing w:before="0" w:after="0" w:line="320" w:lineRule="exact"/>
-        <w:ind w:left="0" w:right="0" w:firstLine="0"/>
-        <w:jc w:val="both"/>
-      </w:pPr>
-      <w:r>
-        <w:rPr>
-          <w:rFonts w:ascii="Archivo Light" w:hAnsi="Archivo Light" w:eastAsia="Archivo Light" w:cs="Archivo Light"/>
-          <w:sz w:val="24"/>
-          <w:szCs w:val="24"/>
-        </w:rPr>
-        <w:t>{cierre_indicador_10}</w:t>
       </w:r>
     </w:p>
     <w:p>
@@ -1059,7 +594,7 @@
           <w:sz w:val="48"/>
           <w:szCs w:val="48"/>
         </w:rPr>
-        <w:t>Indicador 11: Sistemas de información georreferenciados</w:t>
+        <w:t>Sistemas de información georreferenciados</w:t>
       </w:r>
     </w:p>
     <w:p>
@@ -1075,51 +610,6 @@
           <w:szCs w:val="24"/>
         </w:rPr>
         <w:t>{analisis_indicador_11}</w:t>
-      </w:r>
-    </w:p>
-    <w:p>
-      <w:pPr>
-        <w:spacing w:before="0" w:after="0" w:line="320" w:lineRule="exact"/>
-        <w:ind w:left="0" w:right="0" w:firstLine="0"/>
-        <w:jc w:val="both"/>
-      </w:pPr>
-      <w:r>
-        <w:rPr>
-          <w:rFonts w:ascii="Archivo Light" w:hAnsi="Archivo Light" w:eastAsia="Archivo Light" w:cs="Archivo Light"/>
-          <w:sz w:val="24"/>
-          <w:szCs w:val="24"/>
-        </w:rPr>
-        <w:t>{graficas_indicador_11}</w:t>
-      </w:r>
-    </w:p>
-    <w:p>
-      <w:pPr>
-        <w:spacing w:before="0" w:after="0" w:line="320" w:lineRule="exact"/>
-        <w:ind w:left="0" w:right="0" w:firstLine="0"/>
-        <w:jc w:val="both"/>
-      </w:pPr>
-      <w:r>
-        <w:rPr>
-          <w:rFonts w:ascii="Archivo Light" w:hAnsi="Archivo Light" w:eastAsia="Archivo Light" w:cs="Archivo Light"/>
-          <w:sz w:val="24"/>
-          <w:szCs w:val="24"/>
-        </w:rPr>
-        <w:t>{tablas_indicador_11}</w:t>
-      </w:r>
-    </w:p>
-    <w:p>
-      <w:pPr>
-        <w:spacing w:before="0" w:after="0" w:line="320" w:lineRule="exact"/>
-        <w:ind w:left="0" w:right="0" w:firstLine="0"/>
-        <w:jc w:val="both"/>
-      </w:pPr>
-      <w:r>
-        <w:rPr>
-          <w:rFonts w:ascii="Archivo Light" w:hAnsi="Archivo Light" w:eastAsia="Archivo Light" w:cs="Archivo Light"/>
-          <w:sz w:val="24"/>
-          <w:szCs w:val="24"/>
-        </w:rPr>
-        <w:t>{cierre_indicador_11}</w:t>
       </w:r>
     </w:p>
     <w:p>
@@ -1141,7 +631,7 @@
           <w:sz w:val="48"/>
           <w:szCs w:val="48"/>
         </w:rPr>
-        <w:t>Indicador 12: Patrullajes estratégicos</w:t>
+        <w:t>Patrullajes estratégicos</w:t>
       </w:r>
     </w:p>
     <w:p>
@@ -1157,51 +647,6 @@
           <w:szCs w:val="24"/>
         </w:rPr>
         <w:t>{analisis_indicador_12}</w:t>
-      </w:r>
-    </w:p>
-    <w:p>
-      <w:pPr>
-        <w:spacing w:before="0" w:after="0" w:line="320" w:lineRule="exact"/>
-        <w:ind w:left="0" w:right="0" w:firstLine="0"/>
-        <w:jc w:val="both"/>
-      </w:pPr>
-      <w:r>
-        <w:rPr>
-          <w:rFonts w:ascii="Archivo Light" w:hAnsi="Archivo Light" w:eastAsia="Archivo Light" w:cs="Archivo Light"/>
-          <w:sz w:val="24"/>
-          <w:szCs w:val="24"/>
-        </w:rPr>
-        <w:t>{graficas_indicador_12}</w:t>
-      </w:r>
-    </w:p>
-    <w:p>
-      <w:pPr>
-        <w:spacing w:before="0" w:after="0" w:line="320" w:lineRule="exact"/>
-        <w:ind w:left="0" w:right="0" w:firstLine="0"/>
-        <w:jc w:val="both"/>
-      </w:pPr>
-      <w:r>
-        <w:rPr>
-          <w:rFonts w:ascii="Archivo Light" w:hAnsi="Archivo Light" w:eastAsia="Archivo Light" w:cs="Archivo Light"/>
-          <w:sz w:val="24"/>
-          <w:szCs w:val="24"/>
-        </w:rPr>
-        <w:t>{tablas_indicador_12}</w:t>
-      </w:r>
-    </w:p>
-    <w:p>
-      <w:pPr>
-        <w:spacing w:before="0" w:after="0" w:line="320" w:lineRule="exact"/>
-        <w:ind w:left="0" w:right="0" w:firstLine="0"/>
-        <w:jc w:val="both"/>
-      </w:pPr>
-      <w:r>
-        <w:rPr>
-          <w:rFonts w:ascii="Archivo Light" w:hAnsi="Archivo Light" w:eastAsia="Archivo Light" w:cs="Archivo Light"/>
-          <w:sz w:val="24"/>
-          <w:szCs w:val="24"/>
-        </w:rPr>
-        <w:t>{cierre_indicador_12}</w:t>
       </w:r>
     </w:p>
     <w:p>
@@ -1223,7 +668,7 @@
           <w:sz w:val="48"/>
           <w:szCs w:val="48"/>
         </w:rPr>
-        <w:t>Indicador 13: Atención a problemas comunitarios</w:t>
+        <w:t>Atención a problemas comunitarios</w:t>
       </w:r>
     </w:p>
     <w:p>
@@ -1239,51 +684,6 @@
           <w:szCs w:val="24"/>
         </w:rPr>
         <w:t>{analisis_indicador_13}</w:t>
-      </w:r>
-    </w:p>
-    <w:p>
-      <w:pPr>
-        <w:spacing w:before="0" w:after="0" w:line="320" w:lineRule="exact"/>
-        <w:ind w:left="0" w:right="0" w:firstLine="0"/>
-        <w:jc w:val="both"/>
-      </w:pPr>
-      <w:r>
-        <w:rPr>
-          <w:rFonts w:ascii="Archivo Light" w:hAnsi="Archivo Light" w:eastAsia="Archivo Light" w:cs="Archivo Light"/>
-          <w:sz w:val="24"/>
-          <w:szCs w:val="24"/>
-        </w:rPr>
-        <w:t>{graficas_indicador_13}</w:t>
-      </w:r>
-    </w:p>
-    <w:p>
-      <w:pPr>
-        <w:spacing w:before="0" w:after="0" w:line="320" w:lineRule="exact"/>
-        <w:ind w:left="0" w:right="0" w:firstLine="0"/>
-        <w:jc w:val="both"/>
-      </w:pPr>
-      <w:r>
-        <w:rPr>
-          <w:rFonts w:ascii="Archivo Light" w:hAnsi="Archivo Light" w:eastAsia="Archivo Light" w:cs="Archivo Light"/>
-          <w:sz w:val="24"/>
-          <w:szCs w:val="24"/>
-        </w:rPr>
-        <w:t>{tablas_indicador_13}</w:t>
-      </w:r>
-    </w:p>
-    <w:p>
-      <w:pPr>
-        <w:spacing w:before="0" w:after="0" w:line="320" w:lineRule="exact"/>
-        <w:ind w:left="0" w:right="0" w:firstLine="0"/>
-        <w:jc w:val="both"/>
-      </w:pPr>
-      <w:r>
-        <w:rPr>
-          <w:rFonts w:ascii="Archivo Light" w:hAnsi="Archivo Light" w:eastAsia="Archivo Light" w:cs="Archivo Light"/>
-          <w:sz w:val="24"/>
-          <w:szCs w:val="24"/>
-        </w:rPr>
-        <w:t>{cierre_indicador_13}</w:t>
       </w:r>
     </w:p>
     <w:p>
@@ -1305,7 +705,7 @@
           <w:sz w:val="48"/>
           <w:szCs w:val="48"/>
         </w:rPr>
-        <w:t>Indicador 14: Cámaras de vigilancia</w:t>
+        <w:t>Cámaras de vigilancia</w:t>
       </w:r>
     </w:p>
     <w:p>
@@ -1321,51 +721,6 @@
           <w:szCs w:val="24"/>
         </w:rPr>
         <w:t>{analisis_indicador_14}</w:t>
-      </w:r>
-    </w:p>
-    <w:p>
-      <w:pPr>
-        <w:spacing w:before="0" w:after="0" w:line="320" w:lineRule="exact"/>
-        <w:ind w:left="0" w:right="0" w:firstLine="0"/>
-        <w:jc w:val="both"/>
-      </w:pPr>
-      <w:r>
-        <w:rPr>
-          <w:rFonts w:ascii="Archivo Light" w:hAnsi="Archivo Light" w:eastAsia="Archivo Light" w:cs="Archivo Light"/>
-          <w:sz w:val="24"/>
-          <w:szCs w:val="24"/>
-        </w:rPr>
-        <w:t>{graficas_indicador_14}</w:t>
-      </w:r>
-    </w:p>
-    <w:p>
-      <w:pPr>
-        <w:spacing w:before="0" w:after="0" w:line="320" w:lineRule="exact"/>
-        <w:ind w:left="0" w:right="0" w:firstLine="0"/>
-        <w:jc w:val="both"/>
-      </w:pPr>
-      <w:r>
-        <w:rPr>
-          <w:rFonts w:ascii="Archivo Light" w:hAnsi="Archivo Light" w:eastAsia="Archivo Light" w:cs="Archivo Light"/>
-          <w:sz w:val="24"/>
-          <w:szCs w:val="24"/>
-        </w:rPr>
-        <w:t>{tablas_indicador_14}</w:t>
-      </w:r>
-    </w:p>
-    <w:p>
-      <w:pPr>
-        <w:spacing w:before="0" w:after="0" w:line="320" w:lineRule="exact"/>
-        <w:ind w:left="0" w:right="0" w:firstLine="0"/>
-        <w:jc w:val="both"/>
-      </w:pPr>
-      <w:r>
-        <w:rPr>
-          <w:rFonts w:ascii="Archivo Light" w:hAnsi="Archivo Light" w:eastAsia="Archivo Light" w:cs="Archivo Light"/>
-          <w:sz w:val="24"/>
-          <w:szCs w:val="24"/>
-        </w:rPr>
-        <w:t>{cierre_indicador_14}</w:t>
       </w:r>
     </w:p>
     <w:p>
@@ -1387,7 +742,7 @@
           <w:sz w:val="48"/>
           <w:szCs w:val="48"/>
         </w:rPr>
-        <w:t>Indicador 15: Llamadas procedentes</w:t>
+        <w:t>Llamadas procedentes</w:t>
       </w:r>
     </w:p>
     <w:p>
@@ -1403,51 +758,6 @@
           <w:szCs w:val="24"/>
         </w:rPr>
         <w:t>{analisis_indicador_15}</w:t>
-      </w:r>
-    </w:p>
-    <w:p>
-      <w:pPr>
-        <w:spacing w:before="0" w:after="0" w:line="320" w:lineRule="exact"/>
-        <w:ind w:left="0" w:right="0" w:firstLine="0"/>
-        <w:jc w:val="both"/>
-      </w:pPr>
-      <w:r>
-        <w:rPr>
-          <w:rFonts w:ascii="Archivo Light" w:hAnsi="Archivo Light" w:eastAsia="Archivo Light" w:cs="Archivo Light"/>
-          <w:sz w:val="24"/>
-          <w:szCs w:val="24"/>
-        </w:rPr>
-        <w:t>{graficas_indicador_15}</w:t>
-      </w:r>
-    </w:p>
-    <w:p>
-      <w:pPr>
-        <w:spacing w:before="0" w:after="0" w:line="320" w:lineRule="exact"/>
-        <w:ind w:left="0" w:right="0" w:firstLine="0"/>
-        <w:jc w:val="both"/>
-      </w:pPr>
-      <w:r>
-        <w:rPr>
-          <w:rFonts w:ascii="Archivo Light" w:hAnsi="Archivo Light" w:eastAsia="Archivo Light" w:cs="Archivo Light"/>
-          <w:sz w:val="24"/>
-          <w:szCs w:val="24"/>
-        </w:rPr>
-        <w:t>{tablas_indicador_15}</w:t>
-      </w:r>
-    </w:p>
-    <w:p>
-      <w:pPr>
-        <w:spacing w:before="0" w:after="0" w:line="320" w:lineRule="exact"/>
-        <w:ind w:left="0" w:right="0" w:firstLine="0"/>
-        <w:jc w:val="both"/>
-      </w:pPr>
-      <w:r>
-        <w:rPr>
-          <w:rFonts w:ascii="Archivo Light" w:hAnsi="Archivo Light" w:eastAsia="Archivo Light" w:cs="Archivo Light"/>
-          <w:sz w:val="24"/>
-          <w:szCs w:val="24"/>
-        </w:rPr>
-        <w:t>{cierre_indicador_15}</w:t>
       </w:r>
     </w:p>
     <w:p>
@@ -1469,7 +779,7 @@
           <w:sz w:val="48"/>
           <w:szCs w:val="48"/>
         </w:rPr>
-        <w:t>Indicador 16: Informe anual de actividades</w:t>
+        <w:t>Informe anual de actividades</w:t>
       </w:r>
     </w:p>
     <w:p>
@@ -1489,6 +799,22 @@
     </w:p>
     <w:p>
       <w:pPr>
+        <w:keepNext/>
+        <w:spacing w:before="0" w:after="0" w:line="280" w:lineRule="atLeast"/>
+        <w:ind w:left="0" w:right="0" w:firstLine="0"/>
+        <w:jc w:val="left"/>
+      </w:pPr>
+      <w:r>
+        <w:rPr>
+          <w:rFonts w:ascii="Archivo Light" w:hAnsi="Archivo Light" w:eastAsia="Archivo Light" w:cs="Archivo Light"/>
+          <w:sz w:val="48"/>
+          <w:szCs w:val="48"/>
+        </w:rPr>
+        <w:t>Cambio del estado de fuerza, egresos y fallecimientos</w:t>
+      </w:r>
+    </w:p>
+    <w:p>
+      <w:pPr>
         <w:spacing w:before="0" w:after="0" w:line="320" w:lineRule="exact"/>
         <w:ind w:left="0" w:right="0" w:firstLine="0"/>
         <w:jc w:val="both"/>
@@ -1499,113 +825,7 @@
           <w:sz w:val="24"/>
           <w:szCs w:val="24"/>
         </w:rPr>
-        <w:t>{graficas_indicador_16}</w:t>
-      </w:r>
-    </w:p>
-    <w:p>
-      <w:pPr>
-        <w:spacing w:before="0" w:after="0" w:line="320" w:lineRule="exact"/>
-        <w:ind w:left="0" w:right="0" w:firstLine="0"/>
-        <w:jc w:val="both"/>
-      </w:pPr>
-      <w:r>
-        <w:rPr>
-          <w:rFonts w:ascii="Archivo Light" w:hAnsi="Archivo Light" w:eastAsia="Archivo Light" w:cs="Archivo Light"/>
-          <w:sz w:val="24"/>
-          <w:szCs w:val="24"/>
-        </w:rPr>
-        <w:t>{tablas_indicador_16}</w:t>
-      </w:r>
-    </w:p>
-    <w:p>
-      <w:pPr>
-        <w:spacing w:before="0" w:after="0" w:line="320" w:lineRule="exact"/>
-        <w:ind w:left="0" w:right="0" w:firstLine="0"/>
-        <w:jc w:val="both"/>
-      </w:pPr>
-      <w:r>
-        <w:rPr>
-          <w:rFonts w:ascii="Archivo Light" w:hAnsi="Archivo Light" w:eastAsia="Archivo Light" w:cs="Archivo Light"/>
-          <w:sz w:val="24"/>
-          <w:szCs w:val="24"/>
-        </w:rPr>
-        <w:t>{cierre_indicador_16}</w:t>
-      </w:r>
-    </w:p>
-    <w:p>
-      <w:pPr>
-        <w:keepNext/>
-        <w:spacing w:before="0" w:after="0" w:line="280" w:lineRule="atLeast"/>
-        <w:ind w:left="0" w:right="0" w:firstLine="0"/>
-        <w:jc w:val="left"/>
-      </w:pPr>
-      <w:r>
-        <w:rPr>
-          <w:rFonts w:ascii="Archivo Light" w:hAnsi="Archivo Light" w:eastAsia="Archivo Light" w:cs="Archivo Light"/>
-          <w:sz w:val="48"/>
-          <w:szCs w:val="48"/>
-        </w:rPr>
-        <w:t>Indicador 17: Cambio del estado de fuerza, egresos y fallecimientos</w:t>
-      </w:r>
-    </w:p>
-    <w:p>
-      <w:pPr>
-        <w:spacing w:before="0" w:after="0" w:line="320" w:lineRule="exact"/>
-        <w:ind w:left="0" w:right="0" w:firstLine="0"/>
-        <w:jc w:val="both"/>
-      </w:pPr>
-      <w:r>
-        <w:rPr>
-          <w:rFonts w:ascii="Archivo Light" w:hAnsi="Archivo Light" w:eastAsia="Archivo Light" w:cs="Archivo Light"/>
-          <w:sz w:val="24"/>
-          <w:szCs w:val="24"/>
-        </w:rPr>
         <w:t>{analisis_indicador_17}</w:t>
-      </w:r>
-    </w:p>
-    <w:p>
-      <w:pPr>
-        <w:spacing w:before="0" w:after="0" w:line="320" w:lineRule="exact"/>
-        <w:ind w:left="0" w:right="0" w:firstLine="0"/>
-        <w:jc w:val="both"/>
-      </w:pPr>
-      <w:r>
-        <w:rPr>
-          <w:rFonts w:ascii="Archivo Light" w:hAnsi="Archivo Light" w:eastAsia="Archivo Light" w:cs="Archivo Light"/>
-          <w:sz w:val="24"/>
-          <w:szCs w:val="24"/>
-        </w:rPr>
-        <w:t>{graficas_indicador_17}</w:t>
-      </w:r>
-    </w:p>
-    <w:p>
-      <w:pPr>
-        <w:spacing w:before="0" w:after="0" w:line="320" w:lineRule="exact"/>
-        <w:ind w:left="0" w:right="0" w:firstLine="0"/>
-        <w:jc w:val="both"/>
-      </w:pPr>
-      <w:r>
-        <w:rPr>
-          <w:rFonts w:ascii="Archivo Light" w:hAnsi="Archivo Light" w:eastAsia="Archivo Light" w:cs="Archivo Light"/>
-          <w:sz w:val="24"/>
-          <w:szCs w:val="24"/>
-        </w:rPr>
-        <w:t>{tablas_indicador_17}</w:t>
-      </w:r>
-    </w:p>
-    <w:p>
-      <w:pPr>
-        <w:spacing w:before="0" w:after="0" w:line="320" w:lineRule="exact"/>
-        <w:ind w:left="0" w:right="0" w:firstLine="0"/>
-        <w:jc w:val="both"/>
-      </w:pPr>
-      <w:r>
-        <w:rPr>
-          <w:rFonts w:ascii="Archivo Light" w:hAnsi="Archivo Light" w:eastAsia="Archivo Light" w:cs="Archivo Light"/>
-          <w:sz w:val="24"/>
-          <w:szCs w:val="24"/>
-        </w:rPr>
-        <w:t>{cierre_indicador_17}</w:t>
       </w:r>
     </w:p>
     <w:p>
@@ -1627,7 +847,7 @@
           <w:sz w:val="48"/>
           <w:szCs w:val="48"/>
         </w:rPr>
-        <w:t>Indicador 18: Puestas a disposición</w:t>
+        <w:t>Puestas a disposición</w:t>
       </w:r>
     </w:p>
     <w:p>
@@ -1643,82 +863,6 @@
           <w:szCs w:val="24"/>
         </w:rPr>
         <w:t>{analisis_indicador_18}</w:t>
-      </w:r>
-    </w:p>
-    <w:p>
-      <w:pPr>
-        <w:spacing w:before="0" w:after="0" w:line="320" w:lineRule="exact"/>
-        <w:ind w:left="0" w:right="0" w:firstLine="0"/>
-        <w:jc w:val="both"/>
-      </w:pPr>
-      <w:r>
-        <w:rPr>
-          <w:rFonts w:ascii="Archivo Light" w:hAnsi="Archivo Light" w:eastAsia="Archivo Light" w:cs="Archivo Light"/>
-          <w:sz w:val="24"/>
-          <w:szCs w:val="24"/>
-        </w:rPr>
-        <w:t>{graficas_indicador_18}</w:t>
-      </w:r>
-    </w:p>
-    <w:p>
-      <w:pPr>
-        <w:spacing w:before="0" w:after="0" w:line="320" w:lineRule="exact"/>
-        <w:ind w:left="0" w:right="0" w:firstLine="0"/>
-        <w:jc w:val="both"/>
-      </w:pPr>
-      <w:r>
-        <w:rPr>
-          <w:rFonts w:ascii="Archivo Light" w:hAnsi="Archivo Light" w:eastAsia="Archivo Light" w:cs="Archivo Light"/>
-          <w:sz w:val="24"/>
-          <w:szCs w:val="24"/>
-        </w:rPr>
-        <w:t>{tablas_indicador_18}</w:t>
-      </w:r>
-    </w:p>
-    <w:p>
-      <w:pPr>
-        <w:spacing w:before="0" w:after="0" w:line="320" w:lineRule="exact"/>
-        <w:ind w:left="0" w:right="0" w:firstLine="0"/>
-        <w:jc w:val="both"/>
-      </w:pPr>
-      <w:r>
-        <w:rPr>
-          <w:rFonts w:ascii="Archivo Light" w:hAnsi="Archivo Light" w:eastAsia="Archivo Light" w:cs="Archivo Light"/>
-          <w:sz w:val="24"/>
-          <w:szCs w:val="24"/>
-        </w:rPr>
-        <w:t>{cierre_indicador_18}</w:t>
-      </w:r>
-    </w:p>
-    <w:p>
-      <w:pPr>
-        <w:keepNext/>
-        <w:spacing w:before="0" w:after="0" w:line="280" w:lineRule="atLeast"/>
-        <w:ind w:left="0" w:right="0" w:firstLine="0"/>
-        <w:jc w:val="left"/>
-      </w:pPr>
-      <w:r>
-        <w:rPr>
-          <w:rFonts w:ascii="Archivo Light" w:hAnsi="Archivo Light" w:eastAsia="Archivo Light" w:cs="Archivo Light"/>
-          <w:sz w:val="48"/>
-          <w:szCs w:val="48"/>
-        </w:rPr>
-        <w:t>Conclusiones</w:t>
-      </w:r>
-    </w:p>
-    <w:p>
-      <w:pPr>
-        <w:spacing w:before="0" w:after="0" w:line="320" w:lineRule="exact"/>
-        <w:ind w:left="0" w:right="0" w:firstLine="0"/>
-        <w:jc w:val="both"/>
-      </w:pPr>
-      <w:r>
-        <w:rPr>
-          <w:rFonts w:ascii="Archivo Light" w:hAnsi="Archivo Light" w:eastAsia="Archivo Light" w:cs="Archivo Light"/>
-          <w:sz w:val="24"/>
-          <w:szCs w:val="24"/>
-        </w:rPr>
-        <w:t>{conclusiones_seguridad}</w:t>
       </w:r>
     </w:p>
     <w:p>

</xml_diff>